<commit_message>
docs: refine AI declaration
</commit_message>
<xml_diff>
--- a/AI_Declaration_CaioJacob2023168.docx
+++ b/AI_Declaration_CaioJacob2023168.docx
@@ -1045,7 +1045,7 @@
         <w:t xml:space="preserve">I also used more specific prompts when developing the poster layout and visual figures. </w:t>
       </w:r>
       <w:r>
-        <w:t>Examples of the prompts used during the project are included in Appendix B.</w:t>
+        <w:t>The main prompt sequences used during the project are documented in Appendix B.</w:t>
       </w:r>
     </w:p>
     <w:p>
@@ -1090,15 +1090,10 @@
     </w:p>
     <w:p>
       <w:r>
-        <w:t xml:space="preserve">I considered privacy, copyright and academic responsibility when using AI tools. I did not provide personal, </w:t>
-      </w:r>
-      <w:proofErr w:type="gramStart"/>
-      <w:r>
-        <w:t>confidential</w:t>
-      </w:r>
-      <w:proofErr w:type="gramEnd"/>
-      <w:r>
-        <w:t xml:space="preserve"> or sensitive information to </w:t>
+        <w:t xml:space="preserve">I considered privacy, copyright and academic responsibility when using AI tools. </w:t>
+      </w:r>
+      <w:r>
+        <w:t xml:space="preserve">I avoided providing confidential or sensitive personal information to </w:t>
       </w:r>
       <w:proofErr w:type="spellStart"/>
       <w:r>
@@ -1106,7 +1101,7 @@
       </w:r>
       <w:proofErr w:type="spellEnd"/>
       <w:r>
-        <w:t>, and the research material provided was based mainly on publicly available information and sources related to the assignment.</w:t>
+        <w:t>. The information used in my prompts was mainly related to the assessment, publicly available research sources and the development of the poster.</w:t>
       </w:r>
     </w:p>
     <w:p>
@@ -1251,7 +1246,7 @@
     </w:p>
     <w:p>
       <w:r>
-        <w:t xml:space="preserve">The following sections document the prompts used with </w:t>
+        <w:t xml:space="preserve">The following sections document the main prompt sequences used with </w:t>
       </w:r>
       <w:proofErr w:type="spellStart"/>
       <w:r>
@@ -1259,7 +1254,7 @@
       </w:r>
       <w:proofErr w:type="spellEnd"/>
       <w:r>
-        <w:t xml:space="preserve"> during the development of the project and show how some prompts were refined as the research developed.</w:t>
+        <w:t xml:space="preserve"> during the development of the project and show how the prompts were refined as the research developed.</w:t>
       </w:r>
     </w:p>
     <w:p>
@@ -3120,10 +3115,20 @@
 </file>
 
 <file path=customXml/item1.xml><?xml version="1.0" encoding="utf-8"?>
-<b:Sources xmlns:b="http://schemas.openxmlformats.org/officeDocument/2006/bibliography" xmlns="http://schemas.openxmlformats.org/officeDocument/2006/bibliography" SelectedStyle="\APASixthEditionOfficeOnline.xsl" StyleName="APA" Version="6"/>
+<p:properties xmlns:p="http://schemas.microsoft.com/office/2006/metadata/properties" xmlns:xsi="http://www.w3.org/2001/XMLSchema-instance" xmlns:pc="http://schemas.microsoft.com/office/infopath/2007/PartnerControls">
+  <documentManagement>
+    <_activity xmlns="b16a9495-4dfd-42d3-807b-98cb11f03b43" xsi:nil="true"/>
+  </documentManagement>
+</p:properties>
 </file>
 
 <file path=customXml/item2.xml><?xml version="1.0" encoding="utf-8"?>
+<go:gDocsCustomXmlDataStorage xmlns:go="http://customooxmlschemas.google.com/" xmlns:r="http://schemas.openxmlformats.org/officeDocument/2006/relationships" uri="GoogleDocsCustomDataVersion2">
+  <go:docsCustomData xmlns:go="http://customooxmlschemas.google.com/" roundtripDataSignature="AMtx7miehlgh2pzFvkmpnhkVaeODs3Wnuw==">CgMxLjAyCGguZ2pkZ3hzMgloLjMwajB6bGwyCWguMWZvYjl0ZTIJaC4zem55c2g3MgloLjJldDkycDAyDmgua2ZranMzcndsMmMxOAByITF6bEVRVXYyWkdtTjZWemdfYk5uaGpmb0x1c2hhYUo3dw==</go:docsCustomData>
+</go:gDocsCustomXmlDataStorage>
+</file>
+
+<file path=customXml/item3.xml><?xml version="1.0" encoding="utf-8"?>
 <ct:contentTypeSchema xmlns:ct="http://schemas.microsoft.com/office/2006/metadata/contentType" xmlns:ma="http://schemas.microsoft.com/office/2006/metadata/properties/metaAttributes" ct:_="" ma:_="" ma:contentTypeName="Document" ma:contentTypeID="0x01010091CA7052A48FB44E8BAE44044031FC77" ma:contentTypeVersion="5" ma:contentTypeDescription="Create a new document." ma:contentTypeScope="" ma:versionID="72110da391d7bf7bbbd9879cda66318c">
   <xsd:schema xmlns:xsd="http://www.w3.org/2001/XMLSchema" xmlns:xs="http://www.w3.org/2001/XMLSchema" xmlns:p="http://schemas.microsoft.com/office/2006/metadata/properties" xmlns:ns3="b16a9495-4dfd-42d3-807b-98cb11f03b43" targetNamespace="http://schemas.microsoft.com/office/2006/metadata/properties" ma:root="true" ma:fieldsID="65d4c4ab10123b5e2192ffab3149626d" ns3:_="">
     <xsd:import namespace="b16a9495-4dfd-42d3-807b-98cb11f03b43"/>
@@ -3273,30 +3278,11 @@
 </ct:contentTypeSchema>
 </file>
 
-<file path=customXml/item3.xml><?xml version="1.0" encoding="utf-8"?>
-<go:gDocsCustomXmlDataStorage xmlns:go="http://customooxmlschemas.google.com/" xmlns:r="http://schemas.openxmlformats.org/officeDocument/2006/relationships" uri="GoogleDocsCustomDataVersion2">
-  <go:docsCustomData xmlns:go="http://customooxmlschemas.google.com/" roundtripDataSignature="AMtx7miehlgh2pzFvkmpnhkVaeODs3Wnuw==">CgMxLjAyCGguZ2pkZ3hzMgloLjMwajB6bGwyCWguMWZvYjl0ZTIJaC4zem55c2g3MgloLjJldDkycDAyDmgua2ZranMzcndsMmMxOAByITF6bEVRVXYyWkdtTjZWemdfYk5uaGpmb0x1c2hhYUo3dw==</go:docsCustomData>
-</go:gDocsCustomXmlDataStorage>
-</file>
-
 <file path=customXml/item4.xml><?xml version="1.0" encoding="utf-8"?>
-<p:properties xmlns:p="http://schemas.microsoft.com/office/2006/metadata/properties" xmlns:xsi="http://www.w3.org/2001/XMLSchema-instance" xmlns:pc="http://schemas.microsoft.com/office/infopath/2007/PartnerControls">
-  <documentManagement>
-    <_activity xmlns="b16a9495-4dfd-42d3-807b-98cb11f03b43" xsi:nil="true"/>
-  </documentManagement>
-</p:properties>
+<b:Sources xmlns:b="http://schemas.openxmlformats.org/officeDocument/2006/bibliography" xmlns="http://schemas.openxmlformats.org/officeDocument/2006/bibliography" SelectedStyle="\APASixthEditionOfficeOnline.xsl" StyleName="APA" Version="6"/>
 </file>
 
 <file path=customXml/item5.xml><?xml version="1.0" encoding="utf-8"?>
-<?mso-contentType ?>
-<FormTemplates xmlns="http://schemas.microsoft.com/sharepoint/v3/contenttype/forms">
-  <Display>DocumentLibraryForm</Display>
-  <Edit>DocumentLibraryForm</Edit>
-  <New>DocumentLibraryForm</New>
-</FormTemplates>
-</file>
-
-<file path=customXml/item6.xml><?xml version="1.0" encoding="utf-8"?>
 <s:customData xmlns="http://www.wps.cn/officeDocument/2013/wpsCustomData" xmlns:s="http://www.wps.cn/officeDocument/2013/wpsCustomData">
   <customSectProps>
     <customSectPr/>
@@ -3307,15 +3293,35 @@
 </s:customData>
 </file>
 
+<file path=customXml/item6.xml><?xml version="1.0" encoding="utf-8"?>
+<?mso-contentType ?>
+<FormTemplates xmlns="http://schemas.microsoft.com/sharepoint/v3/contenttype/forms">
+  <Display>DocumentLibraryForm</Display>
+  <Edit>DocumentLibraryForm</Edit>
+  <New>DocumentLibraryForm</New>
+</FormTemplates>
+</file>
+
 <file path=customXml/itemProps1.xml><?xml version="1.0" encoding="utf-8"?>
-<ds:datastoreItem xmlns:ds="http://schemas.openxmlformats.org/officeDocument/2006/customXml" ds:itemID="{A5C61161-19E4-4D42-A5DA-EC591AFE0A7D}">
+<ds:datastoreItem xmlns:ds="http://schemas.openxmlformats.org/officeDocument/2006/customXml" ds:itemID="{D51EB97A-8C7A-4EE1-A3AD-E57FDBFA6BEE}">
   <ds:schemaRefs>
-    <ds:schemaRef ds:uri="http://schemas.openxmlformats.org/officeDocument/2006/bibliography"/>
+    <ds:schemaRef ds:uri="http://schemas.microsoft.com/office/2006/metadata/properties"/>
+    <ds:schemaRef ds:uri="http://schemas.microsoft.com/office/infopath/2007/PartnerControls"/>
+    <ds:schemaRef ds:uri="b16a9495-4dfd-42d3-807b-98cb11f03b43"/>
   </ds:schemaRefs>
 </ds:datastoreItem>
 </file>
 
 <file path=customXml/itemProps2.xml><?xml version="1.0" encoding="utf-8"?>
+<ds:datastoreItem xmlns:ds="http://schemas.openxmlformats.org/officeDocument/2006/customXml" ds:itemID="{11111111-1234-1234-1234-123412341234}">
+  <ds:schemaRefs>
+    <ds:schemaRef ds:uri="http://customooxmlschemas.google.com/"/>
+    <ds:schemaRef ds:uri="http://schemas.openxmlformats.org/officeDocument/2006/relationships"/>
+  </ds:schemaRefs>
+</ds:datastoreItem>
+</file>
+
+<file path=customXml/itemProps3.xml><?xml version="1.0" encoding="utf-8"?>
 <ds:datastoreItem xmlns:ds="http://schemas.openxmlformats.org/officeDocument/2006/customXml" ds:itemID="{1CD39011-2B34-4226-8638-59B13D86301D}">
   <ds:schemaRefs>
     <ds:schemaRef ds:uri="http://schemas.microsoft.com/office/2006/metadata/contentType"/>
@@ -3333,37 +3339,26 @@
 </ds:datastoreItem>
 </file>
 
-<file path=customXml/itemProps3.xml><?xml version="1.0" encoding="utf-8"?>
-<ds:datastoreItem xmlns:ds="http://schemas.openxmlformats.org/officeDocument/2006/customXml" ds:itemID="{11111111-1234-1234-1234-123412341234}">
+<file path=customXml/itemProps4.xml><?xml version="1.0" encoding="utf-8"?>
+<ds:datastoreItem xmlns:ds="http://schemas.openxmlformats.org/officeDocument/2006/customXml" ds:itemID="{A5C61161-19E4-4D42-A5DA-EC591AFE0A7D}">
   <ds:schemaRefs>
-    <ds:schemaRef ds:uri="http://customooxmlschemas.google.com/"/>
-    <ds:schemaRef ds:uri="http://schemas.openxmlformats.org/officeDocument/2006/relationships"/>
-  </ds:schemaRefs>
-</ds:datastoreItem>
-</file>
-
-<file path=customXml/itemProps4.xml><?xml version="1.0" encoding="utf-8"?>
-<ds:datastoreItem xmlns:ds="http://schemas.openxmlformats.org/officeDocument/2006/customXml" ds:itemID="{D51EB97A-8C7A-4EE1-A3AD-E57FDBFA6BEE}">
-  <ds:schemaRefs>
-    <ds:schemaRef ds:uri="http://schemas.microsoft.com/office/2006/metadata/properties"/>
-    <ds:schemaRef ds:uri="http://schemas.microsoft.com/office/infopath/2007/PartnerControls"/>
-    <ds:schemaRef ds:uri="b16a9495-4dfd-42d3-807b-98cb11f03b43"/>
+    <ds:schemaRef ds:uri="http://schemas.openxmlformats.org/officeDocument/2006/bibliography"/>
   </ds:schemaRefs>
 </ds:datastoreItem>
 </file>
 
 <file path=customXml/itemProps5.xml><?xml version="1.0" encoding="utf-8"?>
+<ds:datastoreItem xmlns:ds="http://schemas.openxmlformats.org/officeDocument/2006/customXml" ds:itemID="{B1977F7D-205B-4081-913C-38D41E755F92}">
+  <ds:schemaRefs>
+    <ds:schemaRef ds:uri="http://www.wps.cn/officeDocument/2013/wpsCustomData"/>
+  </ds:schemaRefs>
+</ds:datastoreItem>
+</file>
+
+<file path=customXml/itemProps6.xml><?xml version="1.0" encoding="utf-8"?>
 <ds:datastoreItem xmlns:ds="http://schemas.openxmlformats.org/officeDocument/2006/customXml" ds:itemID="{AD64260C-1345-4C21-A804-B9FBE7B91489}">
   <ds:schemaRefs>
     <ds:schemaRef ds:uri="http://schemas.microsoft.com/sharepoint/v3/contenttype/forms"/>
   </ds:schemaRefs>
 </ds:datastoreItem>
-</file>
-
-<file path=customXml/itemProps6.xml><?xml version="1.0" encoding="utf-8"?>
-<ds:datastoreItem xmlns:ds="http://schemas.openxmlformats.org/officeDocument/2006/customXml" ds:itemID="{B1977F7D-205B-4081-913C-38D41E755F92}">
-  <ds:schemaRefs>
-    <ds:schemaRef ds:uri="http://www.wps.cn/officeDocument/2013/wpsCustomData"/>
-  </ds:schemaRefs>
-</ds:datastoreItem>
 </file>
</xml_diff>

<commit_message>
docs: add submission date to AI declaration
</commit_message>
<xml_diff>
--- a/AI_Declaration_CaioJacob2023168.docx
+++ b/AI_Declaration_CaioJacob2023168.docx
@@ -697,6 +697,15 @@
                 <w:lang w:val="en-GB"/>
               </w:rPr>
             </w:pPr>
+            <w:r>
+              <w:rPr>
+                <w:color w:val="000000"/>
+                <w:sz w:val="32"/>
+                <w:szCs w:val="32"/>
+                <w:lang w:val="en-GB"/>
+              </w:rPr>
+              <w:t>18/10/2026</w:t>
+            </w:r>
           </w:p>
         </w:tc>
       </w:tr>
@@ -726,23 +735,7 @@
           <w:sz w:val="28"/>
           <w:szCs w:val="28"/>
         </w:rPr>
-        <w:t xml:space="preserve">I acknowledge the use of </w:t>
-      </w:r>
-      <w:proofErr w:type="spellStart"/>
-      <w:r>
-        <w:rPr>
-          <w:sz w:val="28"/>
-          <w:szCs w:val="28"/>
-        </w:rPr>
-        <w:t>ChatGPT</w:t>
-      </w:r>
-      <w:proofErr w:type="spellEnd"/>
-      <w:r>
-        <w:rPr>
-          <w:sz w:val="28"/>
-          <w:szCs w:val="28"/>
-        </w:rPr>
-        <w:t xml:space="preserve"> during the development of this assessment for brainstorming, research organisation, reviewing written content, and developing visual concepts. All AI-generated suggestions were reviewed and verified by me.</w:t>
+        <w:t>I acknowledge the use of ChatGPT during the development of this assessment for brainstorming, research organisation, reviewing written content, and developing visual concepts. All AI-generated suggestions were reviewed and verified by me.</w:t>
       </w:r>
     </w:p>
     <w:p>
@@ -947,31 +940,7 @@
     </w:p>
     <w:p>
       <w:r>
-        <w:t xml:space="preserve">Generative AI was used during the development of this assessment as a supporting tool rather than as a replacement for my own research, </w:t>
-      </w:r>
-      <w:proofErr w:type="gramStart"/>
-      <w:r>
-        <w:t>analysis</w:t>
-      </w:r>
-      <w:proofErr w:type="gramEnd"/>
-      <w:r>
-        <w:t xml:space="preserve"> or decision-making. I used AI mainly to help with brainstorming, organising ideas, improving written clarity, developing visual </w:t>
-      </w:r>
-      <w:proofErr w:type="gramStart"/>
-      <w:r>
-        <w:t>concepts</w:t>
-      </w:r>
-      <w:proofErr w:type="gramEnd"/>
-      <w:r>
-        <w:t xml:space="preserve"> and reviewing parts of the project. I remained responsible for selecting the final sources, checking </w:t>
-      </w:r>
-      <w:proofErr w:type="gramStart"/>
-      <w:r>
-        <w:t>information</w:t>
-      </w:r>
-      <w:proofErr w:type="gramEnd"/>
-      <w:r>
-        <w:t xml:space="preserve"> and making the final decisions about the content of the poster.</w:t>
+        <w:t>Generative AI was used during the development of this assessment as a supporting tool rather than as a replacement for my own research, analysis or decision-making. I used AI mainly to help with brainstorming, organising ideas, improving written clarity, developing visual concepts and reviewing parts of the project. I remained responsible for selecting the final sources, checking information and making the final decisions about the content of the poster.</w:t>
       </w:r>
     </w:p>
     <w:p/>
@@ -990,28 +959,12 @@
     </w:p>
     <w:p>
       <w:r>
-        <w:t xml:space="preserve">I used AI mainly during the early and development stages of the project. It helped me brainstorm possible real-world facial recognition cases, compare different case-study </w:t>
-      </w:r>
-      <w:proofErr w:type="gramStart"/>
-      <w:r>
-        <w:t>options</w:t>
-      </w:r>
-      <w:proofErr w:type="gramEnd"/>
-      <w:r>
-        <w:t xml:space="preserve"> and organise the research into sections suitable for the poster. I also used AI to improve the clarity of some written sections and to develop ideas for the visual diagrams.</w:t>
-      </w:r>
-    </w:p>
-    <w:p>
-      <w:r>
-        <w:t xml:space="preserve">I did not rely on AI to make the final decisions about the main argument of the project. I selected the Robert Williams case myself after comparing the available evidence and deciding that it provided a strong real-world example of the ethical, </w:t>
-      </w:r>
-      <w:proofErr w:type="gramStart"/>
-      <w:r>
-        <w:t>legal</w:t>
-      </w:r>
-      <w:proofErr w:type="gramEnd"/>
-      <w:r>
-        <w:t xml:space="preserve"> and social consequences of facial recognition. </w:t>
+        <w:t>I used AI mainly during the early and development stages of the project. It helped me brainstorm possible real-world facial recognition cases, compare different case-study options and organise the research into sections suitable for the poster. I also used AI to improve the clarity of some written sections and to develop ideas for the visual diagrams.</w:t>
+      </w:r>
+    </w:p>
+    <w:p>
+      <w:r>
+        <w:t xml:space="preserve">I did not rely on AI to make the final decisions about the main argument of the project. I selected the Robert Williams case myself after comparing the available evidence and deciding that it provided a strong real-world example of the ethical, legal and social consequences of facial recognition. </w:t>
       </w:r>
     </w:p>
     <w:p>
@@ -1029,15 +982,7 @@
     </w:p>
     <w:p>
       <w:r>
-        <w:t xml:space="preserve">For example, after considering several facial recognition cases, I asked AI to compare the Robert Williams case, the Metropolitan Police use of facial recognition and the Clearview AI case. I then refined the questions to focus on ethical, </w:t>
-      </w:r>
-      <w:proofErr w:type="gramStart"/>
-      <w:r>
-        <w:t>legal</w:t>
-      </w:r>
-      <w:proofErr w:type="gramEnd"/>
-      <w:r>
-        <w:t xml:space="preserve"> and social impacts, available evidence and possible mitigation measures.</w:t>
+        <w:t>For example, after considering several facial recognition cases, I asked AI to compare the Robert Williams case, the Metropolitan Police use of facial recognition and the Clearview AI case. I then refined the questions to focus on ethical, legal and social impacts, available evidence and possible mitigation measures.</w:t>
       </w:r>
     </w:p>
     <w:p>
@@ -1068,15 +1013,7 @@
     </w:p>
     <w:p>
       <w:r>
-        <w:t xml:space="preserve">I also reviewed the legal and </w:t>
-      </w:r>
-      <w:proofErr w:type="gramStart"/>
-      <w:r>
-        <w:t>factual information</w:t>
-      </w:r>
-      <w:proofErr w:type="gramEnd"/>
-      <w:r>
-        <w:t xml:space="preserve"> about Robert Williams against independent sources, including the University of Michigan Law School and the ACLU. Where AI-generated wording was unclear or too strong, I changed or removed it.</w:t>
+        <w:t>I also reviewed the legal and factual information about Robert Williams against independent sources, including the University of Michigan Law School and the ACLU. Where AI-generated wording was unclear or too strong, I changed or removed it.</w:t>
       </w:r>
     </w:p>
     <w:p>
@@ -1093,28 +1030,12 @@
         <w:t xml:space="preserve">I considered privacy, copyright and academic responsibility when using AI tools. </w:t>
       </w:r>
       <w:r>
-        <w:t xml:space="preserve">I avoided providing confidential or sensitive personal information to </w:t>
-      </w:r>
-      <w:proofErr w:type="spellStart"/>
-      <w:r>
-        <w:t>ChatGPT</w:t>
-      </w:r>
-      <w:proofErr w:type="spellEnd"/>
-      <w:r>
-        <w:t>. The information used in my prompts was mainly related to the assessment, publicly available research sources and the development of the poster.</w:t>
-      </w:r>
-    </w:p>
-    <w:p>
-      <w:r>
-        <w:t xml:space="preserve">I treated AI-generated text and visual material as assistance rather than as a replacement for my own work. Information used in the final poster was checked against the relevant sources and referenced using Harvard style. I remain responsible for the accuracy, </w:t>
-      </w:r>
-      <w:proofErr w:type="gramStart"/>
-      <w:r>
-        <w:t>originality</w:t>
-      </w:r>
-      <w:proofErr w:type="gramEnd"/>
-      <w:r>
-        <w:t xml:space="preserve"> and academic integrity of the final submission.</w:t>
+        <w:t>I avoided providing confidential or sensitive personal information to ChatGPT. The information used in my prompts was mainly related to the assessment, publicly available research sources and the development of the poster.</w:t>
+      </w:r>
+    </w:p>
+    <w:p>
+      <w:r>
+        <w:t>I treated AI-generated text and visual material as assistance rather than as a replacement for my own work. Information used in the final poster was checked against the relevant sources and referenced using Harvard style. I remain responsible for the accuracy, originality and academic integrity of the final submission.</w:t>
       </w:r>
     </w:p>
     <w:p>
@@ -1122,15 +1043,7 @@
         <w:pStyle w:val="Heading1"/>
       </w:pPr>
       <w:r>
-        <w:t xml:space="preserve">Appendix A: </w:t>
-      </w:r>
-      <w:proofErr w:type="spellStart"/>
-      <w:r>
-        <w:t>GenAI</w:t>
-      </w:r>
-      <w:proofErr w:type="spellEnd"/>
-      <w:r>
-        <w:t xml:space="preserve"> Tools Declaration</w:t>
+        <w:t>Appendix A: GenAI Tools Declaration</w:t>
       </w:r>
     </w:p>
     <w:p/>
@@ -1203,11 +1116,9 @@
             <w:pPr>
               <w:jc w:val="center"/>
             </w:pPr>
-            <w:proofErr w:type="spellStart"/>
             <w:r>
               <w:t>ChatGPT</w:t>
             </w:r>
-            <w:proofErr w:type="spellEnd"/>
           </w:p>
         </w:tc>
         <w:tc>
@@ -1221,15 +1132,7 @@
               <w:jc w:val="center"/>
             </w:pPr>
             <w:r>
-              <w:t xml:space="preserve">Brainstorming, research organisation, reviewing written content, developing poster </w:t>
-            </w:r>
-            <w:proofErr w:type="gramStart"/>
-            <w:r>
-              <w:t>content</w:t>
-            </w:r>
-            <w:proofErr w:type="gramEnd"/>
-            <w:r>
-              <w:t xml:space="preserve"> and creating visual concepts</w:t>
+              <w:t>Brainstorming, research organisation, reviewing written content, developing poster content and creating visual concepts</w:t>
             </w:r>
           </w:p>
         </w:tc>
@@ -1246,15 +1149,7 @@
     </w:p>
     <w:p>
       <w:r>
-        <w:t xml:space="preserve">The following sections document the main prompt sequences used with </w:t>
-      </w:r>
-      <w:proofErr w:type="spellStart"/>
-      <w:r>
-        <w:t>ChatGPT</w:t>
-      </w:r>
-      <w:proofErr w:type="spellEnd"/>
-      <w:r>
-        <w:t xml:space="preserve"> during the development of the project and show how the prompts were refined as the research developed.</w:t>
+        <w:t>The following sections document the main prompt sequences used with ChatGPT during the development of the project and show how the prompts were refined as the research developed.</w:t>
       </w:r>
     </w:p>
     <w:p>
@@ -1282,15 +1177,7 @@
     </w:p>
     <w:p>
       <w:r>
-        <w:t xml:space="preserve">What are some </w:t>
-      </w:r>
-      <w:proofErr w:type="gramStart"/>
-      <w:r>
-        <w:t>real world</w:t>
-      </w:r>
-      <w:proofErr w:type="gramEnd"/>
-      <w:r>
-        <w:t xml:space="preserve"> cases where facial recognition caused legal and ethical problems?</w:t>
+        <w:t>What are some real world cases where facial recognition caused legal and ethical problems?</w:t>
       </w:r>
     </w:p>
     <w:p>
@@ -1330,15 +1217,7 @@
     </w:p>
     <w:p>
       <w:r>
-        <w:t xml:space="preserve">Compare three specific law enforcement facial recognition cases: Robert Williams and the Detroit Police Department, the Metropolitan Police London Live Facial Recognition trials, and Clearview AI and the Dutch Data Protection Authority case. Compare them based on ethical impacts, legal consequences, available </w:t>
-      </w:r>
-      <w:proofErr w:type="gramStart"/>
-      <w:r>
-        <w:t>evidence</w:t>
-      </w:r>
-      <w:proofErr w:type="gramEnd"/>
-      <w:r>
-        <w:t xml:space="preserve"> and possible mitigation measures. Which case would provide the strongest real-world case study for an academic poster?</w:t>
+        <w:t>Compare three specific law enforcement facial recognition cases: Robert Williams and the Detroit Police Department, the Metropolitan Police London Live Facial Recognition trials, and Clearview AI and the Dutch Data Protection Authority case. Compare them based on ethical impacts, legal consequences, available evidence and possible mitigation measures. Which case would provide the strongest real-world case study for an academic poster?</w:t>
       </w:r>
     </w:p>
     <w:p>
@@ -1358,15 +1237,7 @@
     </w:p>
     <w:p>
       <w:r>
-        <w:t xml:space="preserve">The comparison helped me identify the Robert Williams case as the strongest case study because there was clear evidence of the facial recognition result, the subsequent </w:t>
-      </w:r>
-      <w:proofErr w:type="gramStart"/>
-      <w:r>
-        <w:t>investigation</w:t>
-      </w:r>
-      <w:proofErr w:type="gramEnd"/>
-      <w:r>
-        <w:t xml:space="preserve"> and the consequences for the individual. I then checked the relevant information against independent sources before selecting the case.</w:t>
+        <w:t>The comparison helped me identify the Robert Williams case as the strongest case study because there was clear evidence of the facial recognition result, the subsequent investigation and the consequences for the individual. I then checked the relevant information against independent sources before selecting the case.</w:t>
       </w:r>
     </w:p>
     <w:p>
@@ -1415,15 +1286,7 @@
     </w:p>
     <w:p>
       <w:r>
-        <w:t xml:space="preserve">The response was too general and did not focus enough on facial recognition, the research </w:t>
-      </w:r>
-      <w:proofErr w:type="gramStart"/>
-      <w:r>
-        <w:t>question</w:t>
-      </w:r>
-      <w:proofErr w:type="gramEnd"/>
-      <w:r>
-        <w:t xml:space="preserve"> or the word limit of the poster.</w:t>
+        <w:t>The response was too general and did not focus enough on facial recognition, the research question or the word limit of the poster.</w:t>
       </w:r>
     </w:p>
     <w:p>
@@ -1443,15 +1306,7 @@
     </w:p>
     <w:p>
       <w:r>
-        <w:t xml:space="preserve">Draft an academic analysis of the ethical, </w:t>
-      </w:r>
-      <w:proofErr w:type="gramStart"/>
-      <w:r>
-        <w:t>legal</w:t>
-      </w:r>
-      <w:proofErr w:type="gramEnd"/>
-      <w:r>
-        <w:t xml:space="preserve"> and social impacts of Computer Vision facial recognition for a poster. Focus on accuracy, demographic differences in performance, automation bias, biometric data, GDPR, the EU AI Act and public trust. Keep the discussion concise and avoid making claims that are stronger than the available evidence.</w:t>
+        <w:t>Draft an academic analysis of the ethical, legal and social impacts of Computer Vision facial recognition for a poster. Focus on accuracy, demographic differences in performance, automation bias, biometric data, GDPR, the EU AI Act and public trust. Keep the discussion concise and avoid making claims that are stronger than the available evidence.</w:t>
       </w:r>
     </w:p>
     <w:p>
@@ -1576,15 +1431,7 @@
     </w:p>
     <w:p>
       <w:r>
-        <w:t xml:space="preserve">Both figures were generated with </w:t>
-      </w:r>
-      <w:proofErr w:type="spellStart"/>
-      <w:r>
-        <w:t>ChatGPT</w:t>
-      </w:r>
-      <w:proofErr w:type="spellEnd"/>
-      <w:r>
-        <w:t xml:space="preserve"> assistance and reviewed by me before being included in the final poster. I checked the content, wording and structure against the research and adjusted the visuals to ensure that they represented the intended information accurately.</w:t>
+        <w:t>Both figures were generated with ChatGPT assistance and reviewed by me before being included in the final poster. I checked the content, wording and structure against the research and adjusted the visuals to ensure that they represented the intended information accurately.</w:t>
       </w:r>
     </w:p>
     <w:sectPr>
@@ -3115,20 +2962,10 @@
 </file>
 
 <file path=customXml/item1.xml><?xml version="1.0" encoding="utf-8"?>
-<p:properties xmlns:p="http://schemas.microsoft.com/office/2006/metadata/properties" xmlns:xsi="http://www.w3.org/2001/XMLSchema-instance" xmlns:pc="http://schemas.microsoft.com/office/infopath/2007/PartnerControls">
-  <documentManagement>
-    <_activity xmlns="b16a9495-4dfd-42d3-807b-98cb11f03b43" xsi:nil="true"/>
-  </documentManagement>
-</p:properties>
+<b:Sources xmlns:b="http://schemas.openxmlformats.org/officeDocument/2006/bibliography" xmlns="http://schemas.openxmlformats.org/officeDocument/2006/bibliography" SelectedStyle="\APASixthEditionOfficeOnline.xsl" StyleName="APA" Version="6"/>
 </file>
 
 <file path=customXml/item2.xml><?xml version="1.0" encoding="utf-8"?>
-<go:gDocsCustomXmlDataStorage xmlns:go="http://customooxmlschemas.google.com/" xmlns:r="http://schemas.openxmlformats.org/officeDocument/2006/relationships" uri="GoogleDocsCustomDataVersion2">
-  <go:docsCustomData xmlns:go="http://customooxmlschemas.google.com/" roundtripDataSignature="AMtx7miehlgh2pzFvkmpnhkVaeODs3Wnuw==">CgMxLjAyCGguZ2pkZ3hzMgloLjMwajB6bGwyCWguMWZvYjl0ZTIJaC4zem55c2g3MgloLjJldDkycDAyDmgua2ZranMzcndsMmMxOAByITF6bEVRVXYyWkdtTjZWemdfYk5uaGpmb0x1c2hhYUo3dw==</go:docsCustomData>
-</go:gDocsCustomXmlDataStorage>
-</file>
-
-<file path=customXml/item3.xml><?xml version="1.0" encoding="utf-8"?>
 <ct:contentTypeSchema xmlns:ct="http://schemas.microsoft.com/office/2006/metadata/contentType" xmlns:ma="http://schemas.microsoft.com/office/2006/metadata/properties/metaAttributes" ct:_="" ma:_="" ma:contentTypeName="Document" ma:contentTypeID="0x01010091CA7052A48FB44E8BAE44044031FC77" ma:contentTypeVersion="5" ma:contentTypeDescription="Create a new document." ma:contentTypeScope="" ma:versionID="72110da391d7bf7bbbd9879cda66318c">
   <xsd:schema xmlns:xsd="http://www.w3.org/2001/XMLSchema" xmlns:xs="http://www.w3.org/2001/XMLSchema" xmlns:p="http://schemas.microsoft.com/office/2006/metadata/properties" xmlns:ns3="b16a9495-4dfd-42d3-807b-98cb11f03b43" targetNamespace="http://schemas.microsoft.com/office/2006/metadata/properties" ma:root="true" ma:fieldsID="65d4c4ab10123b5e2192ffab3149626d" ns3:_="">
     <xsd:import namespace="b16a9495-4dfd-42d3-807b-98cb11f03b43"/>
@@ -3278,11 +3115,30 @@
 </ct:contentTypeSchema>
 </file>
 
+<file path=customXml/item3.xml><?xml version="1.0" encoding="utf-8"?>
+<go:gDocsCustomXmlDataStorage xmlns:go="http://customooxmlschemas.google.com/" xmlns:r="http://schemas.openxmlformats.org/officeDocument/2006/relationships" uri="GoogleDocsCustomDataVersion2">
+  <go:docsCustomData xmlns:go="http://customooxmlschemas.google.com/" roundtripDataSignature="AMtx7miehlgh2pzFvkmpnhkVaeODs3Wnuw==">CgMxLjAyCGguZ2pkZ3hzMgloLjMwajB6bGwyCWguMWZvYjl0ZTIJaC4zem55c2g3MgloLjJldDkycDAyDmgua2ZranMzcndsMmMxOAByITF6bEVRVXYyWkdtTjZWemdfYk5uaGpmb0x1c2hhYUo3dw==</go:docsCustomData>
+</go:gDocsCustomXmlDataStorage>
+</file>
+
 <file path=customXml/item4.xml><?xml version="1.0" encoding="utf-8"?>
-<b:Sources xmlns:b="http://schemas.openxmlformats.org/officeDocument/2006/bibliography" xmlns="http://schemas.openxmlformats.org/officeDocument/2006/bibliography" SelectedStyle="\APASixthEditionOfficeOnline.xsl" StyleName="APA" Version="6"/>
+<p:properties xmlns:p="http://schemas.microsoft.com/office/2006/metadata/properties" xmlns:xsi="http://www.w3.org/2001/XMLSchema-instance" xmlns:pc="http://schemas.microsoft.com/office/infopath/2007/PartnerControls">
+  <documentManagement>
+    <_activity xmlns="b16a9495-4dfd-42d3-807b-98cb11f03b43" xsi:nil="true"/>
+  </documentManagement>
+</p:properties>
 </file>
 
 <file path=customXml/item5.xml><?xml version="1.0" encoding="utf-8"?>
+<?mso-contentType ?>
+<FormTemplates xmlns="http://schemas.microsoft.com/sharepoint/v3/contenttype/forms">
+  <Display>DocumentLibraryForm</Display>
+  <Edit>DocumentLibraryForm</Edit>
+  <New>DocumentLibraryForm</New>
+</FormTemplates>
+</file>
+
+<file path=customXml/item6.xml><?xml version="1.0" encoding="utf-8"?>
 <s:customData xmlns="http://www.wps.cn/officeDocument/2013/wpsCustomData" xmlns:s="http://www.wps.cn/officeDocument/2013/wpsCustomData">
   <customSectProps>
     <customSectPr/>
@@ -3293,35 +3149,15 @@
 </s:customData>
 </file>
 
-<file path=customXml/item6.xml><?xml version="1.0" encoding="utf-8"?>
-<?mso-contentType ?>
-<FormTemplates xmlns="http://schemas.microsoft.com/sharepoint/v3/contenttype/forms">
-  <Display>DocumentLibraryForm</Display>
-  <Edit>DocumentLibraryForm</Edit>
-  <New>DocumentLibraryForm</New>
-</FormTemplates>
-</file>
-
 <file path=customXml/itemProps1.xml><?xml version="1.0" encoding="utf-8"?>
-<ds:datastoreItem xmlns:ds="http://schemas.openxmlformats.org/officeDocument/2006/customXml" ds:itemID="{D51EB97A-8C7A-4EE1-A3AD-E57FDBFA6BEE}">
+<ds:datastoreItem xmlns:ds="http://schemas.openxmlformats.org/officeDocument/2006/customXml" ds:itemID="{A5C61161-19E4-4D42-A5DA-EC591AFE0A7D}">
   <ds:schemaRefs>
-    <ds:schemaRef ds:uri="http://schemas.microsoft.com/office/2006/metadata/properties"/>
-    <ds:schemaRef ds:uri="http://schemas.microsoft.com/office/infopath/2007/PartnerControls"/>
-    <ds:schemaRef ds:uri="b16a9495-4dfd-42d3-807b-98cb11f03b43"/>
+    <ds:schemaRef ds:uri="http://schemas.openxmlformats.org/officeDocument/2006/bibliography"/>
   </ds:schemaRefs>
 </ds:datastoreItem>
 </file>
 
 <file path=customXml/itemProps2.xml><?xml version="1.0" encoding="utf-8"?>
-<ds:datastoreItem xmlns:ds="http://schemas.openxmlformats.org/officeDocument/2006/customXml" ds:itemID="{11111111-1234-1234-1234-123412341234}">
-  <ds:schemaRefs>
-    <ds:schemaRef ds:uri="http://customooxmlschemas.google.com/"/>
-    <ds:schemaRef ds:uri="http://schemas.openxmlformats.org/officeDocument/2006/relationships"/>
-  </ds:schemaRefs>
-</ds:datastoreItem>
-</file>
-
-<file path=customXml/itemProps3.xml><?xml version="1.0" encoding="utf-8"?>
 <ds:datastoreItem xmlns:ds="http://schemas.openxmlformats.org/officeDocument/2006/customXml" ds:itemID="{1CD39011-2B34-4226-8638-59B13D86301D}">
   <ds:schemaRefs>
     <ds:schemaRef ds:uri="http://schemas.microsoft.com/office/2006/metadata/contentType"/>
@@ -3339,26 +3175,37 @@
 </ds:datastoreItem>
 </file>
 
+<file path=customXml/itemProps3.xml><?xml version="1.0" encoding="utf-8"?>
+<ds:datastoreItem xmlns:ds="http://schemas.openxmlformats.org/officeDocument/2006/customXml" ds:itemID="{11111111-1234-1234-1234-123412341234}">
+  <ds:schemaRefs>
+    <ds:schemaRef ds:uri="http://customooxmlschemas.google.com/"/>
+    <ds:schemaRef ds:uri="http://schemas.openxmlformats.org/officeDocument/2006/relationships"/>
+  </ds:schemaRefs>
+</ds:datastoreItem>
+</file>
+
 <file path=customXml/itemProps4.xml><?xml version="1.0" encoding="utf-8"?>
-<ds:datastoreItem xmlns:ds="http://schemas.openxmlformats.org/officeDocument/2006/customXml" ds:itemID="{A5C61161-19E4-4D42-A5DA-EC591AFE0A7D}">
+<ds:datastoreItem xmlns:ds="http://schemas.openxmlformats.org/officeDocument/2006/customXml" ds:itemID="{D51EB97A-8C7A-4EE1-A3AD-E57FDBFA6BEE}">
   <ds:schemaRefs>
-    <ds:schemaRef ds:uri="http://schemas.openxmlformats.org/officeDocument/2006/bibliography"/>
+    <ds:schemaRef ds:uri="http://schemas.microsoft.com/office/2006/metadata/properties"/>
+    <ds:schemaRef ds:uri="http://schemas.microsoft.com/office/infopath/2007/PartnerControls"/>
+    <ds:schemaRef ds:uri="b16a9495-4dfd-42d3-807b-98cb11f03b43"/>
   </ds:schemaRefs>
 </ds:datastoreItem>
 </file>
 
 <file path=customXml/itemProps5.xml><?xml version="1.0" encoding="utf-8"?>
+<ds:datastoreItem xmlns:ds="http://schemas.openxmlformats.org/officeDocument/2006/customXml" ds:itemID="{AD64260C-1345-4C21-A804-B9FBE7B91489}">
+  <ds:schemaRefs>
+    <ds:schemaRef ds:uri="http://schemas.microsoft.com/sharepoint/v3/contenttype/forms"/>
+  </ds:schemaRefs>
+</ds:datastoreItem>
+</file>
+
+<file path=customXml/itemProps6.xml><?xml version="1.0" encoding="utf-8"?>
 <ds:datastoreItem xmlns:ds="http://schemas.openxmlformats.org/officeDocument/2006/customXml" ds:itemID="{B1977F7D-205B-4081-913C-38D41E755F92}">
   <ds:schemaRefs>
     <ds:schemaRef ds:uri="http://www.wps.cn/officeDocument/2013/wpsCustomData"/>
   </ds:schemaRefs>
 </ds:datastoreItem>
-</file>
-
-<file path=customXml/itemProps6.xml><?xml version="1.0" encoding="utf-8"?>
-<ds:datastoreItem xmlns:ds="http://schemas.openxmlformats.org/officeDocument/2006/customXml" ds:itemID="{AD64260C-1345-4C21-A804-B9FBE7B91489}">
-  <ds:schemaRefs>
-    <ds:schemaRef ds:uri="http://schemas.microsoft.com/sharepoint/v3/contenttype/forms"/>
-  </ds:schemaRefs>
-</ds:datastoreItem>
 </file>
</xml_diff>